<commit_message>
Include panel count on page 5
</commit_message>
<xml_diff>
--- a/example-scripts/ames-guide/ames-guide.docx
+++ b/example-scripts/ames-guide/ames-guide.docx
@@ -1118,15 +1118,7 @@
       </w:pPr>
       <w:r>
         <w:rPr/>
-        <w:t xml:space="preserve">March </w:t>
-      </w:r>
-      <w:r>
-        <w:rPr/>
-        <w:t>H</w:t>
-      </w:r>
-      <w:r>
-        <w:rPr/>
-        <w:t>are</w:t>
+        <w:t>March Hare</w:t>
       </w:r>
     </w:p>
     <w:p>
@@ -1194,15 +1186,7 @@
       </w:pPr>
       <w:r>
         <w:rPr/>
-        <w:t xml:space="preserve">March </w:t>
-      </w:r>
-      <w:r>
-        <w:rPr/>
-        <w:t>H</w:t>
-      </w:r>
-      <w:r>
-        <w:rPr/>
-        <w:t>are</w:t>
+        <w:t>March Hare</w:t>
       </w:r>
     </w:p>
     <w:p>
@@ -1423,7 +1407,11 @@
       </w:pPr>
       <w:r>
         <w:rPr/>
-        <w:t>(L)</w:t>
+        <w:t xml:space="preserve">(L) – </w:t>
+      </w:r>
+      <w:r>
+        <w:rPr/>
+        <w:t>5 Panels</w:t>
       </w:r>
     </w:p>
     <w:p>
@@ -2851,7 +2839,7 @@
     <w:pPr>
       <w:widowControl/>
       <w:suppressAutoHyphens w:val="true"/>
-      <w:overflowPunct w:val="false"/>
+      <w:overflowPunct w:val="true"/>
       <w:bidi w:val="0"/>
       <w:spacing w:before="0" w:after="0"/>
       <w:jc w:val="start"/>

</xml_diff>

<commit_message>
Formatting error, left-hand page start
</commit_message>
<xml_diff>
--- a/example-scripts/ames-guide/ames-guide.docx
+++ b/example-scripts/ames-guide/ames-guide.docx
@@ -93,7 +93,15 @@
       </w:pPr>
       <w:r>
         <w:rPr/>
-        <w:t>(L) - 4 Panels</w:t>
+        <w:t>(</w:t>
+      </w:r>
+      <w:r>
+        <w:rPr/>
+        <w:t>R</w:t>
+      </w:r>
+      <w:r>
+        <w:rPr/>
+        <w:t>) - 4 Panels</w:t>
       </w:r>
     </w:p>
     <w:p>
@@ -322,7 +330,15 @@
       </w:pPr>
       <w:r>
         <w:rPr/>
-        <w:t>(R) – 5 Panels</w:t>
+        <w:t>(</w:t>
+      </w:r>
+      <w:r>
+        <w:rPr/>
+        <w:t>L</w:t>
+      </w:r>
+      <w:r>
+        <w:rPr/>
+        <w:t>) – 5 Panels</w:t>
       </w:r>
     </w:p>
     <w:p>
@@ -655,7 +671,15 @@
       </w:pPr>
       <w:r>
         <w:rPr/>
-        <w:t>(L) – 6 Panels</w:t>
+        <w:t>(</w:t>
+      </w:r>
+      <w:r>
+        <w:rPr/>
+        <w:t>R</w:t>
+      </w:r>
+      <w:r>
+        <w:rPr/>
+        <w:t>) – 6 Panels</w:t>
       </w:r>
     </w:p>
     <w:p>
@@ -729,11 +753,7 @@
       </w:r>
       <w:r>
         <w:rPr/>
-        <w:t>i</w:t>
-      </w:r>
-      <w:r>
-        <w:rPr/>
-        <w:t xml:space="preserve">t’s laid for a </w:t>
+        <w:t xml:space="preserve">it’s laid for a </w:t>
       </w:r>
       <w:r>
         <w:rPr>
@@ -976,7 +996,15 @@
       </w:pPr>
       <w:r>
         <w:rPr/>
-        <w:t>(R) - 4 Panels</w:t>
+        <w:t>(</w:t>
+      </w:r>
+      <w:r>
+        <w:rPr/>
+        <w:t>L</w:t>
+      </w:r>
+      <w:r>
+        <w:rPr/>
+        <w:t>) - 4 Panels</w:t>
       </w:r>
     </w:p>
     <w:p>
@@ -1415,7 +1443,15 @@
       </w:pPr>
       <w:r>
         <w:rPr/>
-        <w:t>(L) – 5 Panels</w:t>
+        <w:t>(</w:t>
+      </w:r>
+      <w:r>
+        <w:rPr/>
+        <w:t>R</w:t>
+      </w:r>
+      <w:r>
+        <w:rPr/>
+        <w:t>) – 5 Panels</w:t>
       </w:r>
     </w:p>
     <w:p>
@@ -1520,16 +1556,7 @@
           <w:i/>
           <w:iCs/>
         </w:rPr>
-        <w:t>eat</w:t>
-      </w:r>
-      <w:r>
-        <w:rPr>
-          <w:b w:val="false"/>
-          <w:bCs w:val="false"/>
-          <w:i w:val="false"/>
-          <w:iCs w:val="false"/>
-        </w:rPr>
-        <w:t>”—</w:t>
+        <w:t>eat—”</w:t>
       </w:r>
     </w:p>
     <w:p>
@@ -2843,7 +2870,7 @@
     <w:pPr>
       <w:widowControl/>
       <w:suppressAutoHyphens w:val="true"/>
-      <w:overflowPunct w:val="false"/>
+      <w:overflowPunct w:val="true"/>
       <w:bidi w:val="0"/>
       <w:spacing w:before="0" w:after="0"/>
       <w:jc w:val="start"/>

</xml_diff>